<commit_message>
docs: add project access links and URLs to Word specification documents
</commit_message>
<xml_diff>
--- a/Document_Analyzer_Design_Spec.docx
+++ b/Document_Analyzer_Design_Spec.docx
@@ -6241,6 +6241,266 @@
         <w:t xml:space="preserve">No project information should be invented. Wherever project-specific detail is required, it must come from inspecting the actual project files, and the Vision Perception Stream must be verified as still working before the module is considered done.</w:t>
       </w:r>
     </w:p>
+    <w:p>
+      <w:r>
+        <w:rPr>
+          <w:b/>
+          <w:sz w:val="28"/>
+        </w:rPr>
+        <w:br/>
+        <w:t>Project Access Links &amp; Live URLs</w:t>
+      </w:r>
+    </w:p>
+    <w:p>
+      <w:r>
+        <w:t>The following links provide access to the live public web application dashboard, local backend endpoints, API documentation, and source code repository:</w:t>
+      </w:r>
+    </w:p>
+    <w:tbl>
+      <w:tblPr>
+        <w:tblW w:type="auto" w:w="0"/>
+        <w:jc w:val="center"/>
+        <w:tblLook w:firstColumn="1" w:firstRow="1" w:lastColumn="0" w:lastRow="0" w:noHBand="0" w:noVBand="1" w:val="04A0"/>
+      </w:tblPr>
+      <w:tblGrid>
+        <w:gridCol w:w="3129"/>
+        <w:gridCol w:w="3129"/>
+        <w:gridCol w:w="3129"/>
+      </w:tblGrid>
+      <w:tr>
+        <w:tc>
+          <w:tcPr>
+            <w:tcW w:type="dxa" w:w="3129"/>
+          </w:tcPr>
+          <w:p>
+            <w:r>
+              <w:rPr>
+                <w:b/>
+              </w:rPr>
+              <w:t>Resource / Endpoint</w:t>
+            </w:r>
+          </w:p>
+        </w:tc>
+        <w:tc>
+          <w:tcPr>
+            <w:tcW w:type="dxa" w:w="3129"/>
+          </w:tcPr>
+          <w:p>
+            <w:r>
+              <w:rPr>
+                <w:b/>
+              </w:rPr>
+              <w:t>URL Link</w:t>
+            </w:r>
+          </w:p>
+        </w:tc>
+        <w:tc>
+          <w:tcPr>
+            <w:tcW w:type="dxa" w:w="3129"/>
+          </w:tcPr>
+          <w:p>
+            <w:r>
+              <w:rPr>
+                <w:b/>
+              </w:rPr>
+              <w:t>Description / Notes</w:t>
+            </w:r>
+          </w:p>
+        </w:tc>
+      </w:tr>
+      <w:tr>
+        <w:tc>
+          <w:tcPr>
+            <w:tcW w:type="dxa" w:w="3129"/>
+          </w:tcPr>
+          <w:p>
+            <w:r>
+              <w:t>Public Web URL (Live Tunnel)</w:t>
+            </w:r>
+          </w:p>
+        </w:tc>
+        <w:tc>
+          <w:tcPr>
+            <w:tcW w:type="dxa" w:w="3129"/>
+          </w:tcPr>
+          <w:p>
+            <w:r>
+              <w:t>https://free-houses-pay.loca.lt</w:t>
+            </w:r>
+          </w:p>
+        </w:tc>
+        <w:tc>
+          <w:tcPr>
+            <w:tcW w:type="dxa" w:w="3129"/>
+          </w:tcPr>
+          <w:p>
+            <w:r>
+              <w:t>Live HTTPS web dashboard access (Verification IP: 59.182.208.95)</w:t>
+            </w:r>
+          </w:p>
+        </w:tc>
+      </w:tr>
+      <w:tr>
+        <w:tc>
+          <w:tcPr>
+            <w:tcW w:type="dxa" w:w="3129"/>
+          </w:tcPr>
+          <w:p>
+            <w:r>
+              <w:t>Local Web Dashboard</w:t>
+            </w:r>
+          </w:p>
+        </w:tc>
+        <w:tc>
+          <w:tcPr>
+            <w:tcW w:type="dxa" w:w="3129"/>
+          </w:tcPr>
+          <w:p>
+            <w:r>
+              <w:t>http://localhost:8000</w:t>
+            </w:r>
+          </w:p>
+        </w:tc>
+        <w:tc>
+          <w:tcPr>
+            <w:tcW w:type="dxa" w:w="3129"/>
+          </w:tcPr>
+          <w:p>
+            <w:r>
+              <w:t>Local single-page glassmorphic dashboard</w:t>
+            </w:r>
+          </w:p>
+        </w:tc>
+      </w:tr>
+      <w:tr>
+        <w:tc>
+          <w:tcPr>
+            <w:tcW w:type="dxa" w:w="3129"/>
+          </w:tcPr>
+          <w:p>
+            <w:r>
+              <w:t>Swagger API Docs</w:t>
+            </w:r>
+          </w:p>
+        </w:tc>
+        <w:tc>
+          <w:tcPr>
+            <w:tcW w:type="dxa" w:w="3129"/>
+          </w:tcPr>
+          <w:p>
+            <w:r>
+              <w:t>http://localhost:8000/docs</w:t>
+            </w:r>
+          </w:p>
+        </w:tc>
+        <w:tc>
+          <w:tcPr>
+            <w:tcW w:type="dxa" w:w="3129"/>
+          </w:tcPr>
+          <w:p>
+            <w:r>
+              <w:t>Interactive OpenAPI Swagger UI testing interface</w:t>
+            </w:r>
+          </w:p>
+        </w:tc>
+      </w:tr>
+      <w:tr>
+        <w:tc>
+          <w:tcPr>
+            <w:tcW w:type="dxa" w:w="3129"/>
+          </w:tcPr>
+          <w:p>
+            <w:r>
+              <w:t>ReDoc API Documentation</w:t>
+            </w:r>
+          </w:p>
+        </w:tc>
+        <w:tc>
+          <w:tcPr>
+            <w:tcW w:type="dxa" w:w="3129"/>
+          </w:tcPr>
+          <w:p>
+            <w:r>
+              <w:t>http://localhost:8000/redoc</w:t>
+            </w:r>
+          </w:p>
+        </w:tc>
+        <w:tc>
+          <w:tcPr>
+            <w:tcW w:type="dxa" w:w="3129"/>
+          </w:tcPr>
+          <w:p>
+            <w:r>
+              <w:t>ReDoc OpenAPI specification viewer</w:t>
+            </w:r>
+          </w:p>
+        </w:tc>
+      </w:tr>
+      <w:tr>
+        <w:tc>
+          <w:tcPr>
+            <w:tcW w:type="dxa" w:w="3129"/>
+          </w:tcPr>
+          <w:p>
+            <w:r>
+              <w:t>System Health Endpoint</w:t>
+            </w:r>
+          </w:p>
+        </w:tc>
+        <w:tc>
+          <w:tcPr>
+            <w:tcW w:type="dxa" w:w="3129"/>
+          </w:tcPr>
+          <w:p>
+            <w:r>
+              <w:t>http://localhost:8000/health</w:t>
+            </w:r>
+          </w:p>
+        </w:tc>
+        <w:tc>
+          <w:tcPr>
+            <w:tcW w:type="dxa" w:w="3129"/>
+          </w:tcPr>
+          <w:p>
+            <w:r>
+              <w:t>System health and vector DB diagnostic JSON</w:t>
+            </w:r>
+          </w:p>
+        </w:tc>
+      </w:tr>
+      <w:tr>
+        <w:tc>
+          <w:tcPr>
+            <w:tcW w:type="dxa" w:w="3129"/>
+          </w:tcPr>
+          <w:p>
+            <w:r>
+              <w:t>GitHub Repository</w:t>
+            </w:r>
+          </w:p>
+        </w:tc>
+        <w:tc>
+          <w:tcPr>
+            <w:tcW w:type="dxa" w:w="3129"/>
+          </w:tcPr>
+          <w:p>
+            <w:r>
+              <w:t>https://github.com/ssaikaviyan-prog/PROJECT--1-Project-Development-and-AI-Integrate</w:t>
+            </w:r>
+          </w:p>
+        </w:tc>
+        <w:tc>
+          <w:tcPr>
+            <w:tcW w:type="dxa" w:w="3129"/>
+          </w:tcPr>
+          <w:p>
+            <w:r>
+              <w:t>Source code repository &amp; version control</w:t>
+            </w:r>
+          </w:p>
+        </w:tc>
+      </w:tr>
+    </w:tbl>
     <w:sectPr>
       <w:headerReference w:type="default" r:id="rId7"/>
       <w:footerReference w:type="default" r:id="rId8"/>

</xml_diff>